<commit_message>
Rapport ESME v2 : architectures ST-EEGFormer/LaBraM, leviers d'amelioration, slides soutenance
- ch.3 : Â§3.4.2-3.4.4 reecrits (ViT brut, algorithme MAE pas a pas), Â§3.5 LaBraM nouveau (encodeur lu dans labram.py, VQ + masked EEG modeling, tableau point a point, figure 3.2)
- ch.7 : Â§7.7 'Comment ameliorer ces algorithmes' (4 leviers, statuts realise/pret/prospectif, synthese) ; Recul -> Â§7.8
- faits perimes corriges : resume/abstract LOSO chiffre, tableau RSE, sujets durs = observation de discussion, Â§5.11, biblio (LaBraM ICLR 2024, He & Wu 2020)
- DOCX + PDF regeneres (54 p.), STATUT/JOURNAL/AGENTS mis a jour
- pptx_build/build_defense_0921.js -> 3 slides architecture avec notes FR
- corrections rapport Cuong (LDA 8 sujets, LOSO non compare, sujets durs) ; deck Liz 09/09 final

Co-authored-by: Cursor <cursoragent@cursor.com>
</commit_message>
<xml_diff>
--- a/presentations/progress_report_cuong_2026-09.docx
+++ b/presentations/progress_report_cuong_2026-09.docx
@@ -533,7 +533,7 @@
                 <w:sz w:val="18"/>
                 <w:szCs w:val="18"/>
               </w:rPr>
-              <w:t xml:space="preserve">55.7%</w:t>
+              <w:t xml:space="preserve">55.7%*</w:t>
             </w:r>
           </w:p>
         </w:tc>
@@ -671,7 +671,8 @@
                 <w:sz w:val="18"/>
                 <w:szCs w:val="18"/>
               </w:rPr>
-              <w:t xml:space="preserve">~62% (Liz, earlier)</w:t>
+              <w:t xml:space="preserve">Not compared
+(protocol not aligned)</w:t>
             </w:r>
           </w:p>
         </w:tc>
@@ -770,7 +771,21 @@
           <w:sz w:val="22"/>
           <w:szCs w:val="22"/>
         </w:rPr>
-        <w:t xml:space="preserve">Per-subject spread is large. Subjects that stay hard in both ST-EEGFormer and LaBraM include 004, 019, 020, 031 and 046 (015 is also worth a closer look). Easy examples on our side include 007, 029, 048 and 051.</w:t>
+        <w:t xml:space="preserve">* The available LDA figure is from the 8-subject part0 table, not a full 43-subject result.</w:t>
+      </w:r>
+    </w:p>
+    <w:p>
+      <w:pPr>
+        <w:spacing w:after="160" w:line="276"/>
+      </w:pPr>
+      <w:r>
+        <w:rPr>
+          <w:rFonts w:ascii="Calibri" w:cs="Calibri" w:eastAsia="Calibri" w:hAnsi="Calibri"/>
+          <w:color w:val="1F2933"/>
+          <w:sz w:val="22"/>
+          <w:szCs w:val="22"/>
+        </w:rPr>
+        <w:t xml:space="preserve">Per-subject spread is large. During the 2 September side-by-side discussion with Liz, subjects 004, 019, 020, 031 and 046 were flagged while reviewing the two result sets (015 is also worth monitoring). This is a discussion-based observation, not yet a formal cross-model correlation analysis. Easy examples on our side include 007, 029, 048 and 051.</w:t>
       </w:r>
     </w:p>
     <w:p>

</xml_diff>